<commit_message>
TS 7.5 Jatai Ghanam files final Tamil
</commit_message>
<xml_diff>
--- a/TS-Kramam/TS-4.3/TS 4.3 Tamil Krama Paatam Corrections.docx
+++ b/TS-Kramam/TS-4.3/TS 4.3 Tamil Krama Paatam Corrections.docx
@@ -83,6 +83,7 @@
         </w:rPr>
         <w:t xml:space="preserve">Observed till </w:t>
       </w:r>
+      <w:proofErr w:type="spellStart"/>
       <w:r>
         <w:rPr>
           <w:b/>
@@ -94,6 +95,7 @@
         </w:rPr>
         <w:t>xxxxxxx</w:t>
       </w:r>
+      <w:proofErr w:type="spellEnd"/>
     </w:p>
     <w:p>
       <w:pPr>
@@ -2791,6 +2793,9 @@
     </w:tbl>
     <w:p>
       <w:pPr>
+        <w:pBdr>
+          <w:bottom w:val="double" w:sz="6" w:space="1" w:color="auto"/>
+        </w:pBdr>
         <w:jc w:val="center"/>
         <w:rPr>
           <w:b/>
@@ -2800,7 +2805,10 @@
           <w:u w:val="single"/>
         </w:rPr>
       </w:pPr>
-      <w:r>
+    </w:p>
+    <w:p>
+      <w:pPr>
+        <w:jc w:val="center"/>
         <w:rPr>
           <w:b/>
           <w:bCs/>
@@ -2808,8 +2816,7 @@
           <w:szCs w:val="32"/>
           <w:u w:val="single"/>
         </w:rPr>
-        <w:t>==================</w:t>
-      </w:r>
+      </w:pPr>
     </w:p>
     <w:p>
       <w:pPr>
@@ -2830,6 +2837,7 @@
           <w:szCs w:val="32"/>
           <w:u w:val="single"/>
         </w:rPr>
+        <w:lastRenderedPageBreak/>
         <w:t xml:space="preserve">TS </w:t>
       </w:r>
       <w:r>
@@ -2983,7 +2991,6 @@
                 <w:sz w:val="32"/>
                 <w:szCs w:val="32"/>
               </w:rPr>
-              <w:lastRenderedPageBreak/>
               <w:t>Section, Paragraph</w:t>
             </w:r>
           </w:p>
@@ -3442,6 +3449,7 @@
               </w:rPr>
               <w:t>…</w:t>
             </w:r>
+            <w:proofErr w:type="gramStart"/>
             <w:r>
               <w:rPr>
                 <w:rFonts w:cs="Latha"/>
@@ -3484,6 +3492,7 @@
               </w:rPr>
               <w:t>ஷி</w:t>
             </w:r>
+            <w:proofErr w:type="gramEnd"/>
             <w:r>
               <w:rPr>
                 <w:rFonts w:ascii="BRH Tamil Tab Extra" w:hAnsi="BRH Tamil Tab Extra" w:cs="Arial"/>
@@ -5441,6 +5450,7 @@
                 <w:sz w:val="28"/>
                 <w:szCs w:val="32"/>
               </w:rPr>
+              <w:lastRenderedPageBreak/>
               <w:t>T.S.4.3.1.1 – Kramam</w:t>
             </w:r>
           </w:p>
@@ -5997,7 +6007,6 @@
                 <w:sz w:val="28"/>
                 <w:szCs w:val="32"/>
               </w:rPr>
-              <w:lastRenderedPageBreak/>
               <w:t>T.S.</w:t>
             </w:r>
             <w:r>
@@ -9392,6 +9401,7 @@
                 <w:sz w:val="28"/>
                 <w:szCs w:val="32"/>
               </w:rPr>
+              <w:lastRenderedPageBreak/>
               <w:t>T.S.4.3.9.2 – Kramam</w:t>
             </w:r>
           </w:p>
@@ -10062,7 +10072,6 @@
                 <w:sz w:val="28"/>
                 <w:szCs w:val="32"/>
               </w:rPr>
-              <w:lastRenderedPageBreak/>
               <w:t>T.S.4.3.9.2 – Kramam</w:t>
             </w:r>
           </w:p>
@@ -11771,7 +11780,23 @@
                 <w:b/>
                 <w:bCs/>
               </w:rPr>
-              <w:t>tead of avagraham)</w:t>
+              <w:t xml:space="preserve">tead of </w:t>
+            </w:r>
+            <w:proofErr w:type="spellStart"/>
+            <w:r>
+              <w:rPr>
+                <w:b/>
+                <w:bCs/>
+              </w:rPr>
+              <w:t>avagraham</w:t>
+            </w:r>
+            <w:proofErr w:type="spellEnd"/>
+            <w:r>
+              <w:rPr>
+                <w:b/>
+                <w:bCs/>
+              </w:rPr>
+              <w:t>)</w:t>
             </w:r>
           </w:p>
         </w:tc>
@@ -12309,7 +12334,23 @@
                 <w:b/>
                 <w:bCs/>
               </w:rPr>
-              <w:t>tead of avagraham)</w:t>
+              <w:t xml:space="preserve">tead of </w:t>
+            </w:r>
+            <w:proofErr w:type="spellStart"/>
+            <w:r>
+              <w:rPr>
+                <w:b/>
+                <w:bCs/>
+              </w:rPr>
+              <w:t>avagraham</w:t>
+            </w:r>
+            <w:proofErr w:type="spellEnd"/>
+            <w:r>
+              <w:rPr>
+                <w:b/>
+                <w:bCs/>
+              </w:rPr>
+              <w:t>)</w:t>
             </w:r>
           </w:p>
         </w:tc>
@@ -13736,6 +13777,7 @@
                 <w:sz w:val="28"/>
                 <w:szCs w:val="32"/>
               </w:rPr>
+              <w:lastRenderedPageBreak/>
               <w:t>T.S.4.3.12.2 – Kramam</w:t>
             </w:r>
           </w:p>
@@ -14347,7 +14389,6 @@
                 <w:sz w:val="28"/>
                 <w:szCs w:val="32"/>
               </w:rPr>
-              <w:lastRenderedPageBreak/>
               <w:t>T.S.4.3.13.1 – Kramam</w:t>
             </w:r>
           </w:p>
@@ -15273,7 +15314,23 @@
                 <w:b/>
                 <w:bCs/>
               </w:rPr>
-              <w:t>tead of avagraham)</w:t>
+              <w:t xml:space="preserve">tead of </w:t>
+            </w:r>
+            <w:proofErr w:type="spellStart"/>
+            <w:r>
+              <w:rPr>
+                <w:b/>
+                <w:bCs/>
+              </w:rPr>
+              <w:t>avagraham</w:t>
+            </w:r>
+            <w:proofErr w:type="spellEnd"/>
+            <w:r>
+              <w:rPr>
+                <w:b/>
+                <w:bCs/>
+              </w:rPr>
+              <w:t>)</w:t>
             </w:r>
           </w:p>
         </w:tc>
@@ -17837,6 +17894,7 @@
                 <w:sz w:val="28"/>
                 <w:szCs w:val="32"/>
               </w:rPr>
+              <w:lastRenderedPageBreak/>
               <w:t>T.S.4.3.13.8 – Kramam</w:t>
             </w:r>
           </w:p>
@@ -18366,7 +18424,16 @@
           <w:bCs/>
           <w:sz w:val="32"/>
         </w:rPr>
-        <w:t>replaced with</w:t>
+        <w:t xml:space="preserve">replaced </w:t>
+      </w:r>
+      <w:proofErr w:type="gramStart"/>
+      <w:r>
+        <w:rPr>
+          <w:b/>
+          <w:bCs/>
+          <w:sz w:val="32"/>
+        </w:rPr>
+        <w:t>with</w:t>
       </w:r>
       <w:r>
         <w:rPr>
@@ -18388,6 +18455,7 @@
         </w:rPr>
         <w:t>"</w:t>
       </w:r>
+      <w:proofErr w:type="gramEnd"/>
       <w:r>
         <w:rPr>
           <w:rFonts w:ascii="Latha" w:hAnsi="Latha" w:cs="Latha"/>

</xml_diff>